<commit_message>
Integrate AI capabilities directly into the operator's view
Embed AI functionality within the OCC for the Shadow Bridge, displaying live transcript, sentiment, and compliance flags directly to the operator.

Replit-Commit-Author: Agent
Replit-Commit-Session-Id: 0cbe7a84-a7a6-4a51-b09c-2be09cbda9ee
Replit-Commit-Checkpoint-Type: full_checkpoint
Replit-Commit-Event-Id: 177b6268-6d9c-49c7-945f-43092b3a1cda
Replit-Commit-Screenshot-Url: https://storage.googleapis.com/screenshot-production-us-central1/1f99a8d9-3543-48bc-8564-b0463564e29d/0cbe7a84-a7a6-4a51-b09c-2be09cbda9ee/f9vU1WC
</commit_message>
<xml_diff>
--- a/public/CuraLive_ShadowBridge.docx
+++ b/public/CuraLive_ShadowBridge.docx
@@ -346,19 +346,8 @@
     </w:tbl>
     <w:p>
       <w:pPr>
-        <w:spacing w:after="70" w:before="70"/>
-        <w:jc w:val="center"/>
-      </w:pPr>
-      <w:r>
-        <w:rPr>
-          <w:b/>
-          <w:bCs/>
-          <w:color w:val="6B7280"/>
-          <w:sz w:val="28"/>
-          <w:szCs w:val="28"/>
-        </w:rPr>
-        <w:t xml:space="preserve">↓          ↓          ↓</w:t>
-      </w:r>
+        <w:spacing w:after="0" w:before="40"/>
+      </w:pPr>
     </w:p>
     <w:tbl>
       <w:tblPr>
@@ -374,33 +363,29 @@
       </w:tblPr>
       <w:tblGrid>
         <w:gridCol w:w="100"/>
-        <w:gridCol w:w="100"/>
-        <w:gridCol w:w="100"/>
-        <w:gridCol w:w="100"/>
-        <w:gridCol w:w="100"/>
       </w:tblGrid>
       <w:tr>
         <w:tc>
           <w:tcPr>
-            <w:tcW w:type="dxa" w:w="2900"/>
-            <w:tcBorders>
-              <w:top w:val="none" w:color="FFFFFF" w:sz="0"/>
-              <w:left w:val="none" w:color="FFFFFF" w:sz="0"/>
-              <w:bottom w:val="none" w:color="FFFFFF" w:sz="0"/>
-              <w:right w:val="none" w:color="FFFFFF" w:sz="0"/>
-            </w:tcBorders>
-            <w:shd w:color="1E40AF" w:val="solid"/>
+            <w:tcW w:type="dxa" w:w="9000"/>
+            <w:tcBorders>
+              <w:top w:val="none" w:color="FFFFFF" w:sz="0"/>
+              <w:left w:val="none" w:color="FFFFFF" w:sz="0"/>
+              <w:bottom w:val="none" w:color="FFFFFF" w:sz="0"/>
+              <w:right w:val="none" w:color="FFFFFF" w:sz="0"/>
+            </w:tcBorders>
+            <w:shd w:color="1B4332" w:val="solid"/>
             <w:tcMar>
-              <w:top w:type="dxa" w:w="140"/>
-              <w:left w:type="dxa" w:w="180"/>
-              <w:bottom w:type="dxa" w:w="140"/>
-              <w:right w:type="dxa" w:w="180"/>
+              <w:top w:type="dxa" w:w="160"/>
+              <w:left w:type="dxa" w:w="280"/>
+              <w:bottom w:type="dxa" w:w="160"/>
+              <w:right w:type="dxa" w:w="280"/>
             </w:tcMar>
             <w:vAlign w:val="center"/>
           </w:tcPr>
           <w:p>
             <w:pPr>
-              <w:spacing w:after="30" w:before="0"/>
+              <w:spacing w:after="0" w:before="0"/>
               <w:jc w:val="center"/>
             </w:pPr>
             <w:r>
@@ -408,15 +393,15 @@
                 <w:b/>
                 <w:bCs/>
                 <w:color w:val="FFFFFF"/>
-                <w:sz w:val="21"/>
-                <w:szCs w:val="21"/>
-              </w:rPr>
-              <w:t xml:space="preserve">📞  Twilio Dials</w:t>
-            </w:r>
-          </w:p>
-          <w:p>
-            <w:pPr>
-              <w:spacing w:after="30" w:before="0"/>
+                <w:sz w:val="26"/>
+                <w:szCs w:val="26"/>
+              </w:rPr>
+              <w:t xml:space="preserve">🤖   AI embedded within OCC</w:t>
+            </w:r>
+          </w:p>
+          <w:p>
+            <w:pPr>
+              <w:spacing w:after="0" w:before="50"/>
               <w:jc w:val="center"/>
             </w:pPr>
             <w:r>
@@ -424,136 +409,10 @@
                 <w:b w:val="false"/>
                 <w:bCs w:val="false"/>
                 <w:color w:val="FFFFFF"/>
-                <w:sz w:val="17"/>
-                <w:szCs w:val="17"/>
-              </w:rPr>
-              <w:t xml:space="preserve">Outbound call placed to the bridge number</w:t>
-            </w:r>
-          </w:p>
-        </w:tc>
-        <w:tc>
-          <w:tcPr>
-            <w:tcW w:type="dxa" w:w="100"/>
-            <w:tcBorders>
-              <w:top w:val="none" w:color="FFFFFF" w:sz="0"/>
-              <w:left w:val="none" w:color="FFFFFF" w:sz="0"/>
-              <w:bottom w:val="none" w:color="FFFFFF" w:sz="0"/>
-              <w:right w:val="none" w:color="FFFFFF" w:sz="0"/>
-            </w:tcBorders>
-          </w:tcPr>
-          <w:p/>
-        </w:tc>
-        <w:tc>
-          <w:tcPr>
-            <w:tcW w:type="dxa" w:w="2900"/>
-            <w:tcBorders>
-              <w:top w:val="none" w:color="FFFFFF" w:sz="0"/>
-              <w:left w:val="none" w:color="FFFFFF" w:sz="0"/>
-              <w:bottom w:val="none" w:color="FFFFFF" w:sz="0"/>
-              <w:right w:val="none" w:color="FFFFFF" w:sz="0"/>
-            </w:tcBorders>
-            <w:shd w:color="92400E" w:val="solid"/>
-            <w:tcMar>
-              <w:top w:type="dxa" w:w="140"/>
-              <w:left w:type="dxa" w:w="180"/>
-              <w:bottom w:type="dxa" w:w="140"/>
-              <w:right w:type="dxa" w:w="180"/>
-            </w:tcMar>
-            <w:vAlign w:val="center"/>
-          </w:tcPr>
-          <w:p>
-            <w:pPr>
-              <w:spacing w:after="30" w:before="0"/>
-              <w:jc w:val="center"/>
-            </w:pPr>
-            <w:r>
-              <w:rPr>
-                <w:b/>
-                <w:bCs/>
-                <w:color w:val="FFFFFF"/>
-                <w:sz w:val="21"/>
-                <w:szCs w:val="21"/>
-              </w:rPr>
-              <w:t xml:space="preserve">🎹  DTMF Tones</w:t>
-            </w:r>
-          </w:p>
-          <w:p>
-            <w:pPr>
-              <w:spacing w:after="30" w:before="0"/>
-              <w:jc w:val="center"/>
-            </w:pPr>
-            <w:r>
-              <w:rPr>
-                <w:b w:val="false"/>
-                <w:bCs w:val="false"/>
-                <w:color w:val="FFFFFF"/>
-                <w:sz w:val="17"/>
-                <w:szCs w:val="17"/>
-              </w:rPr>
-              <w:t xml:space="preserve">Access code entered automatically on the keypad</w:t>
-            </w:r>
-          </w:p>
-        </w:tc>
-        <w:tc>
-          <w:tcPr>
-            <w:tcW w:type="dxa" w:w="100"/>
-            <w:tcBorders>
-              <w:top w:val="none" w:color="FFFFFF" w:sz="0"/>
-              <w:left w:val="none" w:color="FFFFFF" w:sz="0"/>
-              <w:bottom w:val="none" w:color="FFFFFF" w:sz="0"/>
-              <w:right w:val="none" w:color="FFFFFF" w:sz="0"/>
-            </w:tcBorders>
-          </w:tcPr>
-          <w:p/>
-        </w:tc>
-        <w:tc>
-          <w:tcPr>
-            <w:tcW w:type="dxa" w:w="2900"/>
-            <w:tcBorders>
-              <w:top w:val="none" w:color="FFFFFF" w:sz="0"/>
-              <w:left w:val="none" w:color="FFFFFF" w:sz="0"/>
-              <w:bottom w:val="none" w:color="FFFFFF" w:sz="0"/>
-              <w:right w:val="none" w:color="FFFFFF" w:sz="0"/>
-            </w:tcBorders>
-            <w:shd w:color="5B21B6" w:val="solid"/>
-            <w:tcMar>
-              <w:top w:type="dxa" w:w="140"/>
-              <w:left w:type="dxa" w:w="180"/>
-              <w:bottom w:type="dxa" w:w="140"/>
-              <w:right w:type="dxa" w:w="180"/>
-            </w:tcMar>
-            <w:vAlign w:val="center"/>
-          </w:tcPr>
-          <w:p>
-            <w:pPr>
-              <w:spacing w:after="30" w:before="0"/>
-              <w:jc w:val="center"/>
-            </w:pPr>
-            <w:r>
-              <w:rPr>
-                <w:b/>
-                <w:bCs/>
-                <w:color w:val="FFFFFF"/>
-                <w:sz w:val="21"/>
-                <w:szCs w:val="21"/>
-              </w:rPr>
-              <w:t xml:space="preserve">🤖  Bot Joins Silently</w:t>
-            </w:r>
-          </w:p>
-          <w:p>
-            <w:pPr>
-              <w:spacing w:after="30" w:before="0"/>
-              <w:jc w:val="center"/>
-            </w:pPr>
-            <w:r>
-              <w:rPr>
-                <w:b w:val="false"/>
-                <w:bCs w:val="false"/>
-                <w:color w:val="FFFFFF"/>
-                <w:sz w:val="17"/>
-                <w:szCs w:val="17"/>
-              </w:rPr>
-              <w:t xml:space="preserve">CuraLive is inside the external call</w:t>
+                <w:sz w:val="20"/>
+                <w:szCs w:val="20"/>
+              </w:rPr>
+              <w:t xml:space="preserve">Live transcript  ·  Sentiment scoring  ·  Compliance flags — all visible to the operator in real time</w:t>
             </w:r>
           </w:p>
         </w:tc>
@@ -572,7 +431,7 @@
           <w:sz w:val="28"/>
           <w:szCs w:val="28"/>
         </w:rPr>
-        <w:t xml:space="preserve">↓</w:t>
+        <w:t xml:space="preserve">↓          ↓          ↓</w:t>
       </w:r>
     </w:p>
     <w:tbl>
@@ -589,29 +448,33 @@
       </w:tblPr>
       <w:tblGrid>
         <w:gridCol w:w="100"/>
+        <w:gridCol w:w="100"/>
+        <w:gridCol w:w="100"/>
+        <w:gridCol w:w="100"/>
+        <w:gridCol w:w="100"/>
       </w:tblGrid>
       <w:tr>
         <w:tc>
           <w:tcPr>
-            <w:tcW w:type="dxa" w:w="9000"/>
-            <w:tcBorders>
-              <w:top w:val="none" w:color="FFFFFF" w:sz="0"/>
-              <w:left w:val="none" w:color="FFFFFF" w:sz="0"/>
-              <w:bottom w:val="none" w:color="FFFFFF" w:sz="0"/>
-              <w:right w:val="none" w:color="FFFFFF" w:sz="0"/>
-            </w:tcBorders>
-            <w:shd w:color="4C1D95" w:val="solid"/>
+            <w:tcW w:type="dxa" w:w="2900"/>
+            <w:tcBorders>
+              <w:top w:val="none" w:color="FFFFFF" w:sz="0"/>
+              <w:left w:val="none" w:color="FFFFFF" w:sz="0"/>
+              <w:bottom w:val="none" w:color="FFFFFF" w:sz="0"/>
+              <w:right w:val="none" w:color="FFFFFF" w:sz="0"/>
+            </w:tcBorders>
+            <w:shd w:color="1E40AF" w:val="solid"/>
             <w:tcMar>
-              <w:top w:type="dxa" w:w="160"/>
-              <w:left w:type="dxa" w:w="280"/>
-              <w:bottom w:type="dxa" w:w="160"/>
-              <w:right w:type="dxa" w:w="280"/>
+              <w:top w:type="dxa" w:w="140"/>
+              <w:left w:type="dxa" w:w="180"/>
+              <w:bottom w:type="dxa" w:w="140"/>
+              <w:right w:type="dxa" w:w="180"/>
             </w:tcMar>
             <w:vAlign w:val="center"/>
           </w:tcPr>
           <w:p>
             <w:pPr>
-              <w:spacing w:after="0" w:before="0"/>
+              <w:spacing w:after="30" w:before="0"/>
               <w:jc w:val="center"/>
             </w:pPr>
             <w:r>
@@ -619,15 +482,15 @@
                 <w:b/>
                 <w:bCs/>
                 <w:color w:val="FFFFFF"/>
-                <w:sz w:val="26"/>
-                <w:szCs w:val="26"/>
-              </w:rPr>
-              <w:t xml:space="preserve">🎙️   AI Captures Everything</w:t>
-            </w:r>
-          </w:p>
-          <w:p>
-            <w:pPr>
-              <w:spacing w:after="0" w:before="50"/>
+                <w:sz w:val="21"/>
+                <w:szCs w:val="21"/>
+              </w:rPr>
+              <w:t xml:space="preserve">📞  Twilio Dials</w:t>
+            </w:r>
+          </w:p>
+          <w:p>
+            <w:pPr>
+              <w:spacing w:after="30" w:before="0"/>
               <w:jc w:val="center"/>
             </w:pPr>
             <w:r>
@@ -635,10 +498,136 @@
                 <w:b w:val="false"/>
                 <w:bCs w:val="false"/>
                 <w:color w:val="FFFFFF"/>
-                <w:sz w:val="20"/>
-                <w:szCs w:val="20"/>
-              </w:rPr>
-              <w:t xml:space="preserve">Transcript  ·  Sentiment per speaker  ·  Compliance flags  ·  Full recording</w:t>
+                <w:sz w:val="17"/>
+                <w:szCs w:val="17"/>
+              </w:rPr>
+              <w:t xml:space="preserve">Outbound call placed to the bridge number</w:t>
+            </w:r>
+          </w:p>
+        </w:tc>
+        <w:tc>
+          <w:tcPr>
+            <w:tcW w:type="dxa" w:w="100"/>
+            <w:tcBorders>
+              <w:top w:val="none" w:color="FFFFFF" w:sz="0"/>
+              <w:left w:val="none" w:color="FFFFFF" w:sz="0"/>
+              <w:bottom w:val="none" w:color="FFFFFF" w:sz="0"/>
+              <w:right w:val="none" w:color="FFFFFF" w:sz="0"/>
+            </w:tcBorders>
+          </w:tcPr>
+          <w:p/>
+        </w:tc>
+        <w:tc>
+          <w:tcPr>
+            <w:tcW w:type="dxa" w:w="2900"/>
+            <w:tcBorders>
+              <w:top w:val="none" w:color="FFFFFF" w:sz="0"/>
+              <w:left w:val="none" w:color="FFFFFF" w:sz="0"/>
+              <w:bottom w:val="none" w:color="FFFFFF" w:sz="0"/>
+              <w:right w:val="none" w:color="FFFFFF" w:sz="0"/>
+            </w:tcBorders>
+            <w:shd w:color="92400E" w:val="solid"/>
+            <w:tcMar>
+              <w:top w:type="dxa" w:w="140"/>
+              <w:left w:type="dxa" w:w="180"/>
+              <w:bottom w:type="dxa" w:w="140"/>
+              <w:right w:type="dxa" w:w="180"/>
+            </w:tcMar>
+            <w:vAlign w:val="center"/>
+          </w:tcPr>
+          <w:p>
+            <w:pPr>
+              <w:spacing w:after="30" w:before="0"/>
+              <w:jc w:val="center"/>
+            </w:pPr>
+            <w:r>
+              <w:rPr>
+                <w:b/>
+                <w:bCs/>
+                <w:color w:val="FFFFFF"/>
+                <w:sz w:val="21"/>
+                <w:szCs w:val="21"/>
+              </w:rPr>
+              <w:t xml:space="preserve">🎹  DTMF Tones</w:t>
+            </w:r>
+          </w:p>
+          <w:p>
+            <w:pPr>
+              <w:spacing w:after="30" w:before="0"/>
+              <w:jc w:val="center"/>
+            </w:pPr>
+            <w:r>
+              <w:rPr>
+                <w:b w:val="false"/>
+                <w:bCs w:val="false"/>
+                <w:color w:val="FFFFFF"/>
+                <w:sz w:val="17"/>
+                <w:szCs w:val="17"/>
+              </w:rPr>
+              <w:t xml:space="preserve">Access code entered automatically on the keypad</w:t>
+            </w:r>
+          </w:p>
+        </w:tc>
+        <w:tc>
+          <w:tcPr>
+            <w:tcW w:type="dxa" w:w="100"/>
+            <w:tcBorders>
+              <w:top w:val="none" w:color="FFFFFF" w:sz="0"/>
+              <w:left w:val="none" w:color="FFFFFF" w:sz="0"/>
+              <w:bottom w:val="none" w:color="FFFFFF" w:sz="0"/>
+              <w:right w:val="none" w:color="FFFFFF" w:sz="0"/>
+            </w:tcBorders>
+          </w:tcPr>
+          <w:p/>
+        </w:tc>
+        <w:tc>
+          <w:tcPr>
+            <w:tcW w:type="dxa" w:w="2900"/>
+            <w:tcBorders>
+              <w:top w:val="none" w:color="FFFFFF" w:sz="0"/>
+              <w:left w:val="none" w:color="FFFFFF" w:sz="0"/>
+              <w:bottom w:val="none" w:color="FFFFFF" w:sz="0"/>
+              <w:right w:val="none" w:color="FFFFFF" w:sz="0"/>
+            </w:tcBorders>
+            <w:shd w:color="5B21B6" w:val="solid"/>
+            <w:tcMar>
+              <w:top w:type="dxa" w:w="140"/>
+              <w:left w:type="dxa" w:w="180"/>
+              <w:bottom w:type="dxa" w:w="140"/>
+              <w:right w:type="dxa" w:w="180"/>
+            </w:tcMar>
+            <w:vAlign w:val="center"/>
+          </w:tcPr>
+          <w:p>
+            <w:pPr>
+              <w:spacing w:after="30" w:before="0"/>
+              <w:jc w:val="center"/>
+            </w:pPr>
+            <w:r>
+              <w:rPr>
+                <w:b/>
+                <w:bCs/>
+                <w:color w:val="FFFFFF"/>
+                <w:sz w:val="21"/>
+                <w:szCs w:val="21"/>
+              </w:rPr>
+              <w:t xml:space="preserve">🤖  Bot Joins Silently</w:t>
+            </w:r>
+          </w:p>
+          <w:p>
+            <w:pPr>
+              <w:spacing w:after="30" w:before="0"/>
+              <w:jc w:val="center"/>
+            </w:pPr>
+            <w:r>
+              <w:rPr>
+                <w:b w:val="false"/>
+                <w:bCs w:val="false"/>
+                <w:color w:val="FFFFFF"/>
+                <w:sz w:val="17"/>
+                <w:szCs w:val="17"/>
+              </w:rPr>
+              <w:t xml:space="preserve">CuraLive is inside the external call — AI activates</w:t>
             </w:r>
           </w:p>
         </w:tc>

</xml_diff>